<commit_message>
Add X profile link to site and resume
</commit_message>
<xml_diff>
--- a/Emma-Caroline Avery - Resume.docx
+++ b/Emma-Caroline Avery - Resume.docx
@@ -82,6 +82,26 @@
             <w:u w:val="single"/>
           </w:rPr>
           <w:t xml:space="preserve">Medium</w:t>
+        </w:r>
+      </w:hyperlink>
+      <w:r>
+        <w:rPr>
+          <w:rFonts w:ascii="Times New Roman" w:cs="Times New Roman" w:eastAsia="Times New Roman" w:hAnsi="Times New Roman"/>
+          <w:sz w:val="19"/>
+          <w:szCs w:val="19"/>
+        </w:rPr>
+        <w:t xml:space="preserve"> | </w:t>
+      </w:r>
+      <w:hyperlink w:history="1" r:id="rIdecaXtwitter01">
+        <w:r>
+          <w:rPr>
+            <w:rFonts w:ascii="Times New Roman" w:cs="Times New Roman" w:eastAsia="Times New Roman" w:hAnsi="Times New Roman"/>
+            <w:color w:val="000000"/>
+            <w:sz w:val="19"/>
+            <w:szCs w:val="19"/>
+            <w:u w:val="single"/>
+          </w:rPr>
+          <w:t xml:space="preserve">X</w:t>
         </w:r>
       </w:hyperlink>
     </w:p>

</xml_diff>

<commit_message>
Add Blast Motion report and the foul-ball thread
</commit_message>
<xml_diff>
--- a/Emma-Caroline Avery - Resume.docx
+++ b/Emma-Caroline Avery - Resume.docx
@@ -520,6 +520,24 @@
           <w:szCs w:val="19"/>
         </w:rPr>
         <w:t xml:space="preserve">Own intake and turnaround of ad-hoc coach requests, walk coaching staffs through Paradigm reports and tools, and capture coach feedback in writing so it reaches the analysts and product team</w:t>
+      </w:r>
+    </w:p>
+    <w:p>
+      <w:pPr>
+        <w:pStyle w:val="ListParagraph"/>
+        <w:numPr>
+          <w:ilvl w:val="0"/>
+          <w:numId w:val="2"/>
+        </w:numPr>
+        <w:spacing w:after="10"/>
+      </w:pPr>
+      <w:r>
+        <w:rPr>
+          <w:rFonts w:ascii="Times New Roman" w:cs="Times New Roman" w:eastAsia="Times New Roman" w:hAnsi="Times New Roman"/>
+          <w:sz w:val="19"/>
+          <w:szCs w:val="19"/>
+        </w:rPr>
+        <w:t xml:space="preserve">Analyzed a client program’s Blast Motion bat-sensor data and wrote the staff-facing report: which swing metrics hold up between sessions, how large a change has to be to beat session-to-session noise, and D1 reference ranges for each metric</w:t>
       </w:r>
     </w:p>
     <w:p>

</xml_diff>

<commit_message>
AWRE cameras; advance scouting to past tense
</commit_message>
<xml_diff>
--- a/Emma-Caroline Avery - Resume.docx
+++ b/Emma-Caroline Avery - Resume.docx
@@ -308,7 +308,7 @@
           <w:sz w:val="19"/>
           <w:szCs w:val="19"/>
         </w:rPr>
-        <w:t xml:space="preserve">Write advance-scouting reports on opponents and player-development reports tracking pitcher progress; review video in TruMedia and translate findings for coaches and players</w:t>
+        <w:t xml:space="preserve">Write player-development reports tracking pitcher progress and review video in TruMedia, translating findings for coaches and players; wrote advance-scouting reports on opponents in earlier seasons</w:t>
       </w:r>
     </w:p>
     <w:p>
@@ -643,7 +643,7 @@
           <w:sz w:val="19"/>
           <w:szCs w:val="19"/>
         </w:rPr>
-        <w:t xml:space="preserve">Operated KinaTrax, Trackman, HitTrax, and Trajekt and set up Edgertronic capture during MLB and MiLB bullpens, live BP, cage work, rehab, testing, and pitch-design work</w:t>
+        <w:t xml:space="preserve">Operated KinaTrax, Trackman, HitTrax, and Trajekt and set up Edgertronic and AWRE capture during MLB and MiLB bullpens, live BP, cage work, rehab, testing, and pitch-design work</w:t>
       </w:r>
     </w:p>
     <w:p>
@@ -936,7 +936,7 @@
           <w:sz w:val="19"/>
           <w:szCs w:val="19"/>
         </w:rPr>
-        <w:t xml:space="preserve">Trackman, KinaTrax, Hawkeye, Rapsodo, HitTrax, Trajekt, BATS, Qualisys, Edgertronic, Synergy, TruMedia</w:t>
+        <w:t xml:space="preserve">Trackman, KinaTrax, Hawkeye, Rapsodo, HitTrax, Trajekt, BATS, Qualisys, Edgertronic, AWRE, Synergy, TruMedia</w:t>
       </w:r>
     </w:p>
     <w:p>

</xml_diff>

<commit_message>
Fix camera attribution: Edgertronic and AWRE are Columbia, not Dodgers; add Blast Motion
Co-Authored-By: Claude Opus 5.5 <noreply@anthropic.com>
</commit_message>
<xml_diff>
--- a/Emma-Caroline Avery - Resume.docx
+++ b/Emma-Caroline Avery - Resume.docx
@@ -290,25 +290,25 @@
           <w:sz w:val="19"/>
           <w:szCs w:val="19"/>
         </w:rPr>
-        <w:t xml:space="preserve">Manage the team’s Trackman data pipeline: operate the stadium and portable units with synchronized iPad video, clean, verify, and retag pitch data, and maintain the season database behind every report</w:t>
-      </w:r>
-    </w:p>
-    <w:p>
-      <w:pPr>
-        <w:pStyle w:val="ListParagraph"/>
-        <w:numPr>
-          <w:ilvl w:val="0"/>
-          <w:numId w:val="2"/>
-        </w:numPr>
-        <w:spacing w:after="10"/>
-      </w:pPr>
-      <w:r>
-        <w:rPr>
-          <w:rFonts w:ascii="Times New Roman" w:cs="Times New Roman" w:eastAsia="Times New Roman" w:hAnsi="Times New Roman"/>
-          <w:sz w:val="19"/>
-          <w:szCs w:val="19"/>
-        </w:rPr>
-        <w:t xml:space="preserve">Write player-development reports tracking pitcher progress and review video in TruMedia, translating findings for coaches and players; wrote advance-scouting reports on opponents in earlier seasons</w:t>
+        <w:t xml:space="preserve">Manage the team’s Trackman data pipeline: operate the stadium and portable units with synchronized iPad video, set up Edgertronic cameras, clean, verify, and retag pitch data, and maintain the season database behind every report</w:t>
+      </w:r>
+    </w:p>
+    <w:p>
+      <w:pPr>
+        <w:pStyle w:val="ListParagraph"/>
+        <w:numPr>
+          <w:ilvl w:val="0"/>
+          <w:numId w:val="2"/>
+        </w:numPr>
+        <w:spacing w:after="10"/>
+      </w:pPr>
+      <w:r>
+        <w:rPr>
+          <w:rFonts w:ascii="Times New Roman" w:cs="Times New Roman" w:eastAsia="Times New Roman" w:hAnsi="Times New Roman"/>
+          <w:sz w:val="19"/>
+          <w:szCs w:val="19"/>
+        </w:rPr>
+        <w:t xml:space="preserve">Write player-development reports tracking pitcher progress and review video in TruMedia and game footage on AWRE, translating findings for coaches and players; wrote advance-scouting reports on opponents in earlier seasons</w:t>
       </w:r>
     </w:p>
     <w:p>
@@ -643,7 +643,7 @@
           <w:sz w:val="19"/>
           <w:szCs w:val="19"/>
         </w:rPr>
-        <w:t xml:space="preserve">Operated KinaTrax, Trackman, HitTrax, and Trajekt and set up Edgertronic and AWRE capture during MLB and MiLB bullpens, live BP, cage work, rehab, testing, and pitch-design work</w:t>
+        <w:t xml:space="preserve">Operated KinaTrax, Trackman, HitTrax, and Trajekt during MLB and MiLB bullpens, live BP, cage work, rehab, testing, and pitch-design work</w:t>
       </w:r>
     </w:p>
     <w:p>
@@ -936,7 +936,7 @@
           <w:sz w:val="19"/>
           <w:szCs w:val="19"/>
         </w:rPr>
-        <w:t xml:space="preserve">Trackman, KinaTrax, Hawkeye, Rapsodo, HitTrax, Trajekt, Qualisys, Edgertronic, AWRE, Synergy, TruMedia; familiar with BATS</w:t>
+        <w:t xml:space="preserve">Trackman, KinaTrax, Hawkeye, Rapsodo, HitTrax, Trajekt, Blast Motion, Qualisys, Edgertronic, AWRE, Synergy, TruMedia; familiar with BATS</w:t>
       </w:r>
     </w:p>
     <w:p>

</xml_diff>

<commit_message>
Update resume: independent projects, Columbia and Paradigm work, tech tools
Co-Authored-By: Claude Opus 5.5 <noreply@anthropic.com>
</commit_message>
<xml_diff>
--- a/Emma-Caroline Avery - Resume.docx
+++ b/Emma-Caroline Avery - Resume.docx
@@ -104,6 +104,26 @@
           <w:t xml:space="preserve">X</w:t>
         </w:r>
       </w:hyperlink>
+      <w:r>
+        <w:rPr>
+          <w:rFonts w:ascii="Times New Roman" w:cs="Times New Roman" w:eastAsia="Times New Roman" w:hAnsi="Times New Roman"/>
+          <w:sz w:val="19"/>
+          <w:szCs w:val="19"/>
+        </w:rPr>
+        <w:t xml:space="preserve"> | </w:t>
+      </w:r>
+      <w:hyperlink w:history="1" r:id="rIdecaSite01">
+        <w:r>
+          <w:rPr>
+            <w:rFonts w:ascii="Times New Roman" w:cs="Times New Roman" w:eastAsia="Times New Roman" w:hAnsi="Times New Roman"/>
+            <w:color w:val="000000"/>
+            <w:sz w:val="19"/>
+            <w:szCs w:val="19"/>
+            <w:u w:val="single"/>
+          </w:rPr>
+          <w:t xml:space="preserve">emmacarolinea.github.io</w:t>
+        </w:r>
+      </w:hyperlink>
     </w:p>
     <w:p>
       <w:pPr>
@@ -313,6 +333,24 @@
     </w:p>
     <w:p>
       <w:pPr>
+        <w:pStyle w:val="ListParagraph"/>
+        <w:numPr>
+          <w:ilvl w:val="0"/>
+          <w:numId w:val="2"/>
+        </w:numPr>
+        <w:spacing w:after="10"/>
+      </w:pPr>
+      <w:r>
+        <w:rPr>
+          <w:rFonts w:ascii="Times New Roman" w:cs="Times New Roman" w:eastAsia="Times New Roman" w:hAnsi="Times New Roman"/>
+          <w:sz w:val="19"/>
+          <w:szCs w:val="19"/>
+        </w:rPr>
+        <w:t xml:space="preserve">Write per-pitcher outing notes for the pitching coach, and built a one-page 2025-26 D1 pitch-characteristics reference for the staff</w:t>
+      </w:r>
+    </w:p>
+    <w:p>
+      <w:pPr>
         <w:tabs>
           <w:tab w:val="right" w:pos="11040"/>
         </w:tabs>
@@ -370,25 +408,25 @@
           <w:sz w:val="19"/>
           <w:szCs w:val="19"/>
         </w:rPr>
-        <w:t xml:space="preserve">Oversee game-day technology operations, assigning members to Trackman shifts across practices, scrimmages, and games; train new members and wrote the group’s Trackman onboarding guide</w:t>
-      </w:r>
-    </w:p>
-    <w:p>
-      <w:pPr>
-        <w:pStyle w:val="ListParagraph"/>
-        <w:numPr>
-          <w:ilvl w:val="0"/>
-          <w:numId w:val="2"/>
-        </w:numPr>
-        <w:spacing w:after="10"/>
-      </w:pPr>
-      <w:r>
-        <w:rPr>
-          <w:rFonts w:ascii="Times New Roman" w:cs="Times New Roman" w:eastAsia="Times New Roman" w:hAnsi="Times New Roman"/>
-          <w:sz w:val="19"/>
-          <w:szCs w:val="19"/>
-        </w:rPr>
-        <w:t xml:space="preserve">Run SABRLions’ Instagram and X accounts and game-day watch parties; published </w:t>
+        <w:t xml:space="preserve">Oversee game-day technology operations, assigning members to Trackman shifts across practices, scrimmages, and games; train new members with two browser-based trainers I built (a live-tagging simulator and a pitch-recognition game) and wrote the onboarding guide</w:t>
+      </w:r>
+    </w:p>
+    <w:p>
+      <w:pPr>
+        <w:pStyle w:val="ListParagraph"/>
+        <w:numPr>
+          <w:ilvl w:val="0"/>
+          <w:numId w:val="2"/>
+        </w:numPr>
+        <w:spacing w:after="10"/>
+      </w:pPr>
+      <w:r>
+        <w:rPr>
+          <w:rFonts w:ascii="Times New Roman" w:cs="Times New Roman" w:eastAsia="Times New Roman" w:hAnsi="Times New Roman"/>
+          <w:sz w:val="19"/>
+          <w:szCs w:val="19"/>
+        </w:rPr>
+        <w:t xml:space="preserve">Run SABRLions’ social accounts; published </w:t>
       </w:r>
       <w:r>
         <w:rPr>
@@ -555,7 +593,7 @@
           <w:sz w:val="19"/>
           <w:szCs w:val="19"/>
         </w:rPr>
-        <w:t xml:space="preserve">Research and write data-driven threads for Paradigm’s X account, turning internal findings into content coaches can act on</w:t>
+        <w:t xml:space="preserve">Research and write threads for Paradigm’s X account, including how long college stats take to become reliable (6.56M D1 pitches, 2022-26) and what Blast swing data shows about rotational vs. linear swings</w:t>
       </w:r>
     </w:p>
     <w:p>
@@ -643,43 +681,25 @@
           <w:sz w:val="19"/>
           <w:szCs w:val="19"/>
         </w:rPr>
-        <w:t xml:space="preserve">Operated KinaTrax, Trackman, HitTrax, and Trajekt during MLB and MiLB bullpens, live BP, cage work, rehab, testing, and pitch-design work</w:t>
-      </w:r>
-    </w:p>
-    <w:p>
-      <w:pPr>
-        <w:pStyle w:val="ListParagraph"/>
-        <w:numPr>
-          <w:ilvl w:val="0"/>
-          <w:numId w:val="2"/>
-        </w:numPr>
-        <w:spacing w:after="10"/>
-      </w:pPr>
-      <w:r>
-        <w:rPr>
-          <w:rFonts w:ascii="Times New Roman" w:cs="Times New Roman" w:eastAsia="Times New Roman" w:hAnsi="Times New Roman"/>
-          <w:sz w:val="19"/>
-          <w:szCs w:val="19"/>
-        </w:rPr>
-        <w:t xml:space="preserve">Analyzed KinaTrax biomechanical data to identify player trends, translating findings into staff-facing reports and presentations; wrote a season-long ACL player-development report</w:t>
-      </w:r>
-    </w:p>
-    <w:p>
-      <w:pPr>
-        <w:pStyle w:val="ListParagraph"/>
-        <w:numPr>
-          <w:ilvl w:val="0"/>
-          <w:numId w:val="2"/>
-        </w:numPr>
-        <w:spacing w:after="10"/>
-      </w:pPr>
-      <w:r>
-        <w:rPr>
-          <w:rFonts w:ascii="Times New Roman" w:cs="Times New Roman" w:eastAsia="Times New Roman" w:hAnsi="Times New Roman"/>
-          <w:sz w:val="19"/>
-          <w:szCs w:val="19"/>
-        </w:rPr>
-        <w:t xml:space="preserve">Helped develop individualized player-development and goal plans for ACL players in collaboration with coaches and staff</w:t>
+        <w:t xml:space="preserve">Operated KinaTrax, Trackman, HitTrax, and Trajekt during MLB and MiLB bullpens, live BP, cage work, rehab, testing, and pitch design</w:t>
+      </w:r>
+    </w:p>
+    <w:p>
+      <w:pPr>
+        <w:pStyle w:val="ListParagraph"/>
+        <w:numPr>
+          <w:ilvl w:val="0"/>
+          <w:numId w:val="2"/>
+        </w:numPr>
+        <w:spacing w:after="10"/>
+      </w:pPr>
+      <w:r>
+        <w:rPr>
+          <w:rFonts w:ascii="Times New Roman" w:cs="Times New Roman" w:eastAsia="Times New Roman" w:hAnsi="Times New Roman"/>
+          <w:sz w:val="19"/>
+          <w:szCs w:val="19"/>
+        </w:rPr>
+        <w:t xml:space="preserve">Analyzed KinaTrax biomechanical data to identify player trends, translating findings into staff-facing reports and presentations; wrote a season-long ACL player-development report and helped build individualized player and goal plans with coaches</w:t>
       </w:r>
     </w:p>
     <w:p>
@@ -767,7 +787,7 @@
           <w:sz w:val="19"/>
           <w:szCs w:val="19"/>
         </w:rPr>
-        <w:t xml:space="preserve">Conducted data cleaning and analysis, focusing on overlooked players in the minor leagues for the trade deadline</w:t>
+        <w:t xml:space="preserve">Conducted data cleaning and analysis, focusing on overlooked players in the minor leagues for the trade deadline, and supported pre-draft analysis for the 2024 MLB Draft</w:t>
       </w:r>
     </w:p>
     <w:p>
@@ -786,24 +806,6 @@
           <w:szCs w:val="19"/>
         </w:rPr>
         <w:t xml:space="preserve">Operated KinaTrax during home games to collect biomechanical player-performance data for organizational use</w:t>
-      </w:r>
-    </w:p>
-    <w:p>
-      <w:pPr>
-        <w:pStyle w:val="ListParagraph"/>
-        <w:numPr>
-          <w:ilvl w:val="0"/>
-          <w:numId w:val="2"/>
-        </w:numPr>
-        <w:spacing w:after="10"/>
-      </w:pPr>
-      <w:r>
-        <w:rPr>
-          <w:rFonts w:ascii="Times New Roman" w:cs="Times New Roman" w:eastAsia="Times New Roman" w:hAnsi="Times New Roman"/>
-          <w:sz w:val="19"/>
-          <w:szCs w:val="19"/>
-        </w:rPr>
-        <w:t xml:space="preserve">Supported pre-draft analysis for the 2024 MLB Draft and provided logistical support during draft week</w:t>
       </w:r>
     </w:p>
     <w:p>
@@ -823,77 +825,119 @@
           <w:sz w:val="21"/>
           <w:szCs w:val="21"/>
         </w:rPr>
-        <w:t xml:space="preserve">LEADERSHIP</w:t>
-      </w:r>
-    </w:p>
-    <w:p>
-      <w:pPr>
-        <w:tabs>
-          <w:tab w:val="right" w:pos="11040"/>
-        </w:tabs>
-        <w:spacing w:after="10" w:before="70"/>
-      </w:pPr>
-      <w:r>
-        <w:rPr>
-          <w:rFonts w:ascii="Times New Roman" w:cs="Times New Roman" w:eastAsia="Times New Roman" w:hAnsi="Times New Roman"/>
-          <w:b/>
-          <w:bCs/>
-          <w:sz w:val="19"/>
-          <w:szCs w:val="19"/>
-        </w:rPr>
-        <w:t xml:space="preserve">Alpha Omicron Pi</w:t>
-      </w:r>
-      <w:r>
-        <w:rPr>
-          <w:rFonts w:ascii="Times New Roman" w:cs="Times New Roman" w:eastAsia="Times New Roman" w:hAnsi="Times New Roman"/>
-          <w:sz w:val="19"/>
-          <w:szCs w:val="19"/>
-        </w:rPr>
-        <w:t xml:space="preserve"> | Alpha Chapter, New York, NY</w:t>
-      </w:r>
-      <w:r>
-        <w:rPr>
-          <w:rFonts w:ascii="Times New Roman" w:cs="Times New Roman" w:eastAsia="Times New Roman" w:hAnsi="Times New Roman"/>
-          <w:sz w:val="19"/>
-          <w:szCs w:val="19"/>
-        </w:rPr>
-        <w:t xml:space="preserve"> | </w:t>
-      </w:r>
-      <w:r>
-        <w:rPr>
-          <w:rFonts w:ascii="Times New Roman" w:cs="Times New Roman" w:eastAsia="Times New Roman" w:hAnsi="Times New Roman"/>
-          <w:i/>
-          <w:iCs/>
-          <w:sz w:val="19"/>
-          <w:szCs w:val="19"/>
-        </w:rPr>
-        <w:t xml:space="preserve">Vice President of Operations</w:t>
-      </w:r>
-      <w:r>
-        <w:rPr>
-          <w:rFonts w:ascii="Times New Roman" w:cs="Times New Roman" w:eastAsia="Times New Roman" w:hAnsi="Times New Roman"/>
-          <w:sz w:val="19"/>
-          <w:szCs w:val="19"/>
-        </w:rPr>
-        <w:t xml:space="preserve">	Jan. 2025 - Dec. 2025</w:t>
-      </w:r>
-    </w:p>
-    <w:p>
-      <w:pPr>
-        <w:pStyle w:val="ListParagraph"/>
-        <w:numPr>
-          <w:ilvl w:val="0"/>
-          <w:numId w:val="2"/>
-        </w:numPr>
-        <w:spacing w:after="10"/>
-      </w:pPr>
-      <w:r>
-        <w:rPr>
-          <w:rFonts w:ascii="Times New Roman" w:cs="Times New Roman" w:eastAsia="Times New Roman" w:hAnsi="Times New Roman"/>
-          <w:sz w:val="19"/>
-          <w:szCs w:val="19"/>
-        </w:rPr>
-        <w:t xml:space="preserve">Led chapter operations, reporting, meetings, elections, and executive-team processes; served as acting Chapter President when needed</w:t>
+        <w:t xml:space="preserve">INDEPENDENT PROJECTS (for my own development and to support Columbia Baseball)</w:t>
+      </w:r>
+    </w:p>
+    <w:p>
+      <w:pPr>
+        <w:pStyle w:val="ListParagraph"/>
+        <w:numPr>
+          <w:ilvl w:val="0"/>
+          <w:numId w:val="2"/>
+        </w:numPr>
+        <w:spacing w:after="10"/>
+      </w:pPr>
+      <w:r>
+        <w:rPr>
+          <w:rFonts w:ascii="Times New Roman" w:cs="Times New Roman" w:eastAsia="Times New Roman" w:hAnsi="Times New Roman"/>
+          <w:b/>
+          <w:bCs/>
+          <w:sz w:val="19"/>
+          <w:szCs w:val="19"/>
+        </w:rPr>
+        <w:t xml:space="preserve">Video pipelines: </w:t>
+      </w:r>
+      <w:r>
+        <w:rPr>
+          <w:rFonts w:ascii="Times New Roman" w:cs="Times New Roman" w:eastAsia="Times New Roman" w:hAnsi="Times New Roman"/>
+          <w:sz w:val="19"/>
+          <w:szCs w:val="19"/>
+        </w:rPr>
+        <w:t xml:space="preserve">pull Trackman video through its API and FTP and AWRE game footage through the AWRE API, cut it into per-pitch clips synced to Trackman data, and organize 20,000+ clips by pitcher and pitch</w:t>
+      </w:r>
+    </w:p>
+    <w:p>
+      <w:pPr>
+        <w:pStyle w:val="ListParagraph"/>
+        <w:numPr>
+          <w:ilvl w:val="0"/>
+          <w:numId w:val="2"/>
+        </w:numPr>
+        <w:spacing w:after="10"/>
+      </w:pPr>
+      <w:r>
+        <w:rPr>
+          <w:rFonts w:ascii="Times New Roman" w:cs="Times New Roman" w:eastAsia="Times New Roman" w:hAnsi="Times New Roman"/>
+          <w:b/>
+          <w:bCs/>
+          <w:sz w:val="19"/>
+          <w:szCs w:val="19"/>
+        </w:rPr>
+        <w:t xml:space="preserve">Pose estimation: </w:t>
+      </w:r>
+      <w:r>
+        <w:rPr>
+          <w:rFonts w:ascii="Times New Roman" w:cs="Times New Roman" w:eastAsia="Times New Roman" w:hAnsi="Times New Roman"/>
+          <w:sz w:val="19"/>
+          <w:szCs w:val="19"/>
+        </w:rPr>
+        <w:t xml:space="preserve">run skeleton tracking on bullpen iPad, Edgertronic, and AWRE game video (~6,500 pitches) to build delivery metrics, overlays, per-pitcher delivery cards, release-frame detection, and time to plate</w:t>
+      </w:r>
+    </w:p>
+    <w:p>
+      <w:pPr>
+        <w:pStyle w:val="ListParagraph"/>
+        <w:numPr>
+          <w:ilvl w:val="0"/>
+          <w:numId w:val="2"/>
+        </w:numPr>
+        <w:spacing w:after="10"/>
+      </w:pPr>
+      <w:r>
+        <w:rPr>
+          <w:rFonts w:ascii="Times New Roman" w:cs="Times New Roman" w:eastAsia="Times New Roman" w:hAnsi="Times New Roman"/>
+          <w:b/>
+          <w:bCs/>
+          <w:sz w:val="19"/>
+          <w:szCs w:val="19"/>
+        </w:rPr>
+        <w:t xml:space="preserve">Pitch tipping: </w:t>
+      </w:r>
+      <w:r>
+        <w:rPr>
+          <w:rFonts w:ascii="Times New Roman" w:cs="Times New Roman" w:eastAsia="Times New Roman" w:hAnsi="Times New Roman"/>
+          <w:sz w:val="19"/>
+          <w:szCs w:val="19"/>
+        </w:rPr>
+        <w:t xml:space="preserve">tested set-position and delivery video for tells that predict pitch type, with cross-validation and multiple-testing correction, and made side-by-side comparison videos for flagged pitchers</w:t>
+      </w:r>
+    </w:p>
+    <w:p>
+      <w:pPr>
+        <w:pStyle w:val="ListParagraph"/>
+        <w:numPr>
+          <w:ilvl w:val="0"/>
+          <w:numId w:val="2"/>
+        </w:numPr>
+        <w:spacing w:after="10"/>
+      </w:pPr>
+      <w:r>
+        <w:rPr>
+          <w:rFonts w:ascii="Times New Roman" w:cs="Times New Roman" w:eastAsia="Times New Roman" w:hAnsi="Times New Roman"/>
+          <w:b/>
+          <w:bCs/>
+          <w:sz w:val="19"/>
+          <w:szCs w:val="19"/>
+        </w:rPr>
+        <w:t xml:space="preserve">Research: </w:t>
+      </w:r>
+      <w:r>
+        <w:rPr>
+          <w:rFonts w:ascii="Times New Roman" w:cs="Times New Roman" w:eastAsia="Times New Roman" w:hAnsi="Times New Roman"/>
+          <w:sz w:val="19"/>
+          <w:szCs w:val="19"/>
+        </w:rPr>
+        <w:t xml:space="preserve">arm slot, usage, and availability across ~17,000 D1 pitcher-seasons (Medium article in progress); bullpen-to-game transfer; pitch-quality (Stuff+) modeling; mental performance signals in Trackman data</w:t>
       </w:r>
     </w:p>
     <w:p>
@@ -936,7 +980,7 @@
           <w:sz w:val="19"/>
           <w:szCs w:val="19"/>
         </w:rPr>
-        <w:t xml:space="preserve">Trackman, KinaTrax, Hawkeye, Rapsodo, HitTrax, Trajekt, Blast Motion, Qualisys, Edgertronic, AWRE, Synergy, TruMedia; familiar with BATS</w:t>
+        <w:t xml:space="preserve">Trackman, KinaTrax, Hawkeye, Rapsodo, HitTrax, Trajekt, Blast Motion, Qualisys, Edgertronic, AWRE, Sony, Synergy, TruMedia; familiar with BATS</w:t>
       </w:r>
     </w:p>
     <w:p>
@@ -959,7 +1003,7 @@
           <w:sz w:val="19"/>
           <w:szCs w:val="19"/>
         </w:rPr>
-        <w:t xml:space="preserve">Microsoft Excel and Word, R, Python, SQL (developing), Adobe Lightroom, Adobe Premiere Pro, Canva, social media content creation</w:t>
+        <w:t xml:space="preserve">Microsoft Excel, R, Python (pose estimation with RTMPose/YOLO, Trackman and AWRE APIs, FTP pipelines), SQL (developing), Adobe Lightroom, Adobe Premiere Pro, Canva</w:t>
       </w:r>
     </w:p>
     <w:p>

</xml_diff>

<commit_message>
Resume: restore Leadership, tighten bullets, Microsoft Office
Co-Authored-By: Claude Opus 5.5 <noreply@anthropic.com>
</commit_message>
<xml_diff>
--- a/Emma-Caroline Avery - Resume.docx
+++ b/Emma-Caroline Avery - Resume.docx
@@ -557,7 +557,7 @@
           <w:sz w:val="19"/>
           <w:szCs w:val="19"/>
         </w:rPr>
-        <w:t xml:space="preserve">Own intake and turnaround of ad-hoc coach requests, walk coaching staffs through Paradigm reports and tools, and capture coach feedback in writing so it reaches the analysts and product team</w:t>
+        <w:t xml:space="preserve">Own intake and turnaround of ad-hoc coach requests, and walk coaching staffs through Paradigm reports and tools</w:t>
       </w:r>
     </w:p>
     <w:p>
@@ -663,7 +663,7 @@
           <w:sz w:val="19"/>
           <w:szCs w:val="19"/>
         </w:rPr>
-        <w:t xml:space="preserve">Worked across ACL hitting, pitching, catching, performance science, biomechanics, and mental performance; joined position-group, player-plan, staff, and GM meetings</w:t>
+        <w:t xml:space="preserve">Worked across ACL hitting, pitching, catching, performance science, biomechanics, and mental performance; joined GM meetings</w:t>
       </w:r>
     </w:p>
     <w:p>
@@ -787,7 +787,7 @@
           <w:sz w:val="19"/>
           <w:szCs w:val="19"/>
         </w:rPr>
-        <w:t xml:space="preserve">Conducted data cleaning and analysis, focusing on overlooked players in the minor leagues for the trade deadline, and supported pre-draft analysis for the 2024 MLB Draft</w:t>
+        <w:t xml:space="preserve">Analyzed overlooked minor league players for the trade deadline and supported 2024 MLB Draft analysis</w:t>
       </w:r>
     </w:p>
     <w:p>
@@ -957,6 +957,96 @@
           <w:sz w:val="21"/>
           <w:szCs w:val="21"/>
         </w:rPr>
+        <w:t xml:space="preserve">LEADERSHIP</w:t>
+      </w:r>
+    </w:p>
+    <w:p>
+      <w:pPr>
+        <w:tabs>
+          <w:tab w:val="right" w:pos="11040"/>
+        </w:tabs>
+        <w:spacing w:after="10" w:before="70"/>
+      </w:pPr>
+      <w:r>
+        <w:rPr>
+          <w:rFonts w:ascii="Times New Roman" w:cs="Times New Roman" w:eastAsia="Times New Roman" w:hAnsi="Times New Roman"/>
+          <w:b/>
+          <w:bCs/>
+          <w:sz w:val="19"/>
+          <w:szCs w:val="19"/>
+        </w:rPr>
+        <w:t xml:space="preserve">Alpha Omicron Pi</w:t>
+      </w:r>
+      <w:r>
+        <w:rPr>
+          <w:rFonts w:ascii="Times New Roman" w:cs="Times New Roman" w:eastAsia="Times New Roman" w:hAnsi="Times New Roman"/>
+          <w:sz w:val="19"/>
+          <w:szCs w:val="19"/>
+        </w:rPr>
+        <w:t xml:space="preserve"> | Alpha Chapter, New York, NY</w:t>
+      </w:r>
+      <w:r>
+        <w:rPr>
+          <w:rFonts w:ascii="Times New Roman" w:cs="Times New Roman" w:eastAsia="Times New Roman" w:hAnsi="Times New Roman"/>
+          <w:sz w:val="19"/>
+          <w:szCs w:val="19"/>
+        </w:rPr>
+        <w:t xml:space="preserve"> | </w:t>
+      </w:r>
+      <w:r>
+        <w:rPr>
+          <w:rFonts w:ascii="Times New Roman" w:cs="Times New Roman" w:eastAsia="Times New Roman" w:hAnsi="Times New Roman"/>
+          <w:i/>
+          <w:iCs/>
+          <w:sz w:val="19"/>
+          <w:szCs w:val="19"/>
+        </w:rPr>
+        <w:t xml:space="preserve">Vice President of Operations</w:t>
+      </w:r>
+      <w:r>
+        <w:rPr>
+          <w:rFonts w:ascii="Times New Roman" w:cs="Times New Roman" w:eastAsia="Times New Roman" w:hAnsi="Times New Roman"/>
+          <w:sz w:val="19"/>
+          <w:szCs w:val="19"/>
+        </w:rPr>
+        <w:t xml:space="preserve">	Jan. 2025 - Dec. 2025</w:t>
+      </w:r>
+    </w:p>
+    <w:p>
+      <w:pPr>
+        <w:pStyle w:val="ListParagraph"/>
+        <w:numPr>
+          <w:ilvl w:val="0"/>
+          <w:numId w:val="2"/>
+        </w:numPr>
+        <w:spacing w:after="10"/>
+      </w:pPr>
+      <w:r>
+        <w:rPr>
+          <w:rFonts w:ascii="Times New Roman" w:cs="Times New Roman" w:eastAsia="Times New Roman" w:hAnsi="Times New Roman"/>
+          <w:sz w:val="19"/>
+          <w:szCs w:val="19"/>
+        </w:rPr>
+        <w:t xml:space="preserve">Led chapter operations, reporting, meetings, elections, and executive-team processes; served as acting Chapter President when needed</w:t>
+      </w:r>
+    </w:p>
+    <w:p>
+      <w:pPr>
+        <w:pBdr>
+          <w:bottom w:val="single" w:color="000000" w:sz="6" w:space="1"/>
+        </w:pBdr>
+        <w:spacing w:after="30" w:before="120"/>
+      </w:pPr>
+      <w:r>
+        <w:rPr>
+          <w:rFonts w:ascii="Times New Roman" w:cs="Times New Roman" w:eastAsia="Times New Roman" w:hAnsi="Times New Roman"/>
+          <w:b/>
+          <w:bCs/>
+          <w:color w:val="000000"/>
+          <w:spacing w:val="10"/>
+          <w:sz w:val="21"/>
+          <w:szCs w:val="21"/>
+        </w:rPr>
         <w:t xml:space="preserve">TECHNICAL SKILLS &amp; LANGUAGES</w:t>
       </w:r>
     </w:p>
@@ -1003,7 +1093,7 @@
           <w:sz w:val="19"/>
           <w:szCs w:val="19"/>
         </w:rPr>
-        <w:t xml:space="preserve">Microsoft Excel, R, Python (pose estimation with RTMPose/YOLO, Trackman and AWRE APIs, FTP pipelines), SQL (developing), Adobe Lightroom, Adobe Premiere Pro, Canva</w:t>
+        <w:t xml:space="preserve">Microsoft Office (Excel, Word), R, Python (pose estimation with RTMPose/YOLO, Trackman and AWRE APIs, FTP pipelines), SQL (developing), Adobe Lightroom, Adobe Premiere Pro, Canva</w:t>
       </w:r>
     </w:p>
     <w:p>

</xml_diff>